<commit_message>
Update AI_Usage_Disclosure_Form.docx with team details (Unsorted Bits, VIT, Team Lead Adharsh Arvinth) and remove presentation script
</commit_message>
<xml_diff>
--- a/AI_Usage_Disclosure_Form.docx
+++ b/AI_Usage_Disclosure_Form.docx
@@ -32,7 +32,7 @@
         <w:t xml:space="preserve">Team Name: </w:t>
       </w:r>
       <w:r>
-        <w:t>_______________________________</w:t>
+        <w:t>Unsorted Bits</w:t>
         <w:br/>
       </w:r>
       <w:r>
@@ -52,7 +52,7 @@
         <w:t xml:space="preserve">Organization / Institution (if any): </w:t>
       </w:r>
       <w:r>
-        <w:t>_______________________________</w:t>
+        <w:t>Vellore Institute of Technology</w:t>
         <w:br/>
       </w:r>
       <w:r>
@@ -228,7 +228,6 @@
         <w:t>AI Tool: Antigravity AI / Gemini. Prompt: 'Implement FAISS vector indexer using SentenceTransformers BAAI/bge-small-en-v1.5'. Output Summary: Created EmbeddingIndex class with normalized inner product search. Modification: Added float32 normalization checks, in-place L2 normalization, and disk caching.</w:t>
       </w:r>
     </w:p>
-    <w:p/>
     <w:p>
       <w:r>
         <w:rPr>
@@ -262,7 +261,6 @@
         <w:t>AI Tool: Antigravity AI. Prompt: 'Build code-aware BM25 tokenizer for camelCase and snake_case'. Output Summary: Built regex-based tokenizer and BM25Okapi ranker. Modification: Refined regex patterns to avoid multiline string consumption and handled fallback tokenizer.</w:t>
       </w:r>
     </w:p>
-    <w:p/>
     <w:p>
       <w:r>
         <w:rPr>
@@ -296,7 +294,6 @@
         <w:t>AI Tool: Antigravity AI. Prompt: 'Implement RRF fusion combining dense and lexical ranks'. Output Summary: Built HybridRetriever using standard RRF formula 1/(k + rank). Modification: Added configurable weighting parameter between semantic and lexical scores.</w:t>
       </w:r>
     </w:p>
-    <w:p/>
     <w:p>
       <w:r>
         <w:rPr>
@@ -330,7 +327,6 @@
         <w:t>AI Tool: Antigravity AI. Prompt: 'Create version-aware index manager and dataset versioner'. Output Summary: Implemented IndexVersioner and DatasetVersioner. Modification: Added metadata persistence, version tagging, and fallback logic for missing version tags.</w:t>
       </w:r>
     </w:p>
-    <w:p/>
     <w:p>
       <w:r>
         <w:rPr>
@@ -364,7 +360,6 @@
         <w:t>AI Tool: Antigravity AI. Prompt: 'Wrap code retrieval model for MTEB 2.x AppsRetrieval evaluation'. Output Summary: Created CodeRetrievalModel inheriting from SentenceTransformerEncoderWrapper. Modification: Added DataLoader unwrapping and Transformers 5.x compatibility patches.</w:t>
       </w:r>
     </w:p>
-    <w:p/>
     <w:p>
       <w:pPr>
         <w:pStyle w:val="Heading2"/>
@@ -410,7 +405,7 @@
         <w:t xml:space="preserve">Name of Team Representative: </w:t>
       </w:r>
       <w:r>
-        <w:t>_______________________________</w:t>
+        <w:t>Adharsh Arvinth</w:t>
         <w:br/>
       </w:r>
       <w:r>
@@ -430,7 +425,7 @@
         <w:t xml:space="preserve">Signature: </w:t>
       </w:r>
       <w:r>
-        <w:t>_______________________________</w:t>
+        <w:t>Adharsh Arvinth</w:t>
         <w:br/>
       </w:r>
       <w:r>

</xml_diff>